<commit_message>
feat: add upstream/downstream prior analysis pipeline and outputs
- add sale/rental prior-to-event dataset scripts and legacy baseline script

- add upstream/downstream analysis scripts, test script, and rendered QMD HTML artifact

- add directional hedonic output tables and update existing prior-result tables

- include repository metadata/config updates (.gitignore, .here, AGENTS.md, CLAUDE.md) and updated meeting note
</commit_message>
<xml_diff>
--- a/docs/meetings/notes for 12 jan 2026.docx
+++ b/docs/meetings/notes for 12 jan 2026.docx
@@ -129,21 +129,7 @@
         <w:rPr>
           <w:rFonts w:ascii="Arial" w:hAnsi="Arial" w:cs="Arial"/>
         </w:rPr>
-        <w:t xml:space="preserve">Observed spills affected by EDM activation and other factors, news stories if </w:t>
-      </w:r>
-      <w:proofErr w:type="gramStart"/>
-      <w:r>
-        <w:rPr>
-          <w:rFonts w:ascii="Arial" w:hAnsi="Arial" w:cs="Arial"/>
-        </w:rPr>
-        <w:t>possible</w:t>
-      </w:r>
-      <w:proofErr w:type="gramEnd"/>
-      <w:r>
-        <w:rPr>
-          <w:rFonts w:ascii="Arial" w:hAnsi="Arial" w:cs="Arial"/>
-        </w:rPr>
-        <w:t xml:space="preserve"> at local level</w:t>
+        <w:t>Observed spills affected by EDM activation and other factors, news stories if possible at local level</w:t>
       </w:r>
     </w:p>
     <w:p>
@@ -168,21 +154,7 @@
         <w:rPr>
           <w:rFonts w:ascii="Arial" w:hAnsi="Arial" w:cs="Arial"/>
         </w:rPr>
-        <w:t xml:space="preserve"> sites like bathing waters and </w:t>
-      </w:r>
-      <w:proofErr w:type="gramStart"/>
-      <w:r>
-        <w:rPr>
-          <w:rFonts w:ascii="Arial" w:hAnsi="Arial" w:cs="Arial"/>
-        </w:rPr>
-        <w:t>SSSIs, and</w:t>
-      </w:r>
-      <w:proofErr w:type="gramEnd"/>
-      <w:r>
-        <w:rPr>
-          <w:rFonts w:ascii="Arial" w:hAnsi="Arial" w:cs="Arial"/>
-        </w:rPr>
-        <w:t xml:space="preserve"> possibly falsify where pressure groups were located. </w:t>
+        <w:t xml:space="preserve"> sites like bathing waters and SSSIs, and possibly falsify where pressure groups were located. </w:t>
       </w:r>
     </w:p>
     <w:p>
@@ -1485,25 +1457,7 @@
           <w:shd w:val="clear" w:color="auto" w:fill="FFFFFF"/>
         </w:rPr>
         <w:lastRenderedPageBreak/>
-        <w:t xml:space="preserve">Hydraulic constraints are inherited from historical network design and affect spill </w:t>
-      </w:r>
-      <w:proofErr w:type="gramStart"/>
-      <w:r>
-        <w:rPr>
-          <w:rFonts w:ascii="Arial" w:hAnsi="Arial" w:cs="Arial"/>
-          <w:color w:val="0F1115"/>
-          <w:shd w:val="clear" w:color="auto" w:fill="FFFFFF"/>
-        </w:rPr>
-        <w:t>probability, but</w:t>
-      </w:r>
-      <w:proofErr w:type="gramEnd"/>
-      <w:r>
-        <w:rPr>
-          <w:rFonts w:ascii="Arial" w:hAnsi="Arial" w:cs="Arial"/>
-          <w:color w:val="0F1115"/>
-          <w:shd w:val="clear" w:color="auto" w:fill="FFFFFF"/>
-        </w:rPr>
-        <w:t xml:space="preserve"> are not salient to modern buyers except via spill risk.</w:t>
+        <w:t>Hydraulic constraints are inherited from historical network design and affect spill probability, but are not salient to modern buyers except via spill risk.</w:t>
       </w:r>
     </w:p>
     <w:p>
@@ -1616,21 +1570,7 @@
         <w:rPr>
           <w:rFonts w:ascii="Arial" w:hAnsi="Arial" w:cs="Arial"/>
         </w:rPr>
-        <w:t xml:space="preserve">What </w:t>
-      </w:r>
-      <w:proofErr w:type="gramStart"/>
-      <w:r>
-        <w:rPr>
-          <w:rFonts w:ascii="Arial" w:hAnsi="Arial" w:cs="Arial"/>
-        </w:rPr>
-        <w:t>we can</w:t>
-      </w:r>
-      <w:proofErr w:type="gramEnd"/>
-      <w:r>
-        <w:rPr>
-          <w:rFonts w:ascii="Arial" w:hAnsi="Arial" w:cs="Arial"/>
-        </w:rPr>
-        <w:t xml:space="preserve"> get from the archives?</w:t>
+        <w:t>What we can get from the archives?</w:t>
       </w:r>
     </w:p>
     <w:p>
@@ -2439,23 +2379,7 @@
           <w:rFonts w:ascii="Arial" w:hAnsi="Arial" w:cs="Arial"/>
           <w:shd w:val="clear" w:color="auto" w:fill="FFFFFF"/>
         </w:rPr>
-        <w:t>Flatter gradients, notes like “tide affected”</w:t>
-      </w:r>
-      <w:proofErr w:type="gramStart"/>
-      <w:r>
-        <w:rPr>
-          <w:rFonts w:ascii="Arial" w:hAnsi="Arial" w:cs="Arial"/>
-          <w:shd w:val="clear" w:color="auto" w:fill="FFFFFF"/>
-        </w:rPr>
-        <w:t>/”backwater</w:t>
-      </w:r>
-      <w:proofErr w:type="gramEnd"/>
-      <w:r>
-        <w:rPr>
-          <w:rFonts w:ascii="Arial" w:hAnsi="Arial" w:cs="Arial"/>
-          <w:shd w:val="clear" w:color="auto" w:fill="FFFFFF"/>
-        </w:rPr>
-        <w:t>”, pipe shape changes, smaller pipes are all good candidates for more spills.</w:t>
+        <w:t>Flatter gradients, notes like “tide affected”/”backwater”, pipe shape changes, smaller pipes are all good candidates for more spills.</w:t>
       </w:r>
     </w:p>
     <w:p>
@@ -2897,7 +2821,7 @@
         <w:rPr>
           <w:rFonts w:ascii="Arial" w:hAnsi="Arial" w:cs="Arial"/>
         </w:rPr>
-        <w:t>https://www.drainageconsultantsltd.co.uk/services/drainage-gradients-falls/</w:t>
+        <w:t>https://www.drainageconsultantsltd.co.uk/services/drainage-gradients-fal</w:t>
       </w:r>
     </w:p>
     <w:p>

</xml_diff>